<commit_message>
Added reusable planet detail pages and global planet navigation
</commit_message>
<xml_diff>
--- a/Plan.docx
+++ b/Plan.docx
@@ -9,8 +9,14 @@
           <w:ilvl w:val="0"/>
           <w:numId w:val="1"/>
         </w:numPr>
-      </w:pPr>
-      <w:r>
+        <w:rPr>
+          <w:color w:val="EE0000"/>
+        </w:rPr>
+      </w:pPr>
+      <w:r>
+        <w:rPr>
+          <w:color w:val="EE0000"/>
+        </w:rPr>
         <w:t>Backup the original Node app completely</w:t>
       </w:r>
     </w:p>
@@ -21,16 +27,28 @@
           <w:ilvl w:val="0"/>
           <w:numId w:val="1"/>
         </w:numPr>
-      </w:pPr>
-      <w:r>
+        <w:rPr>
+          <w:color w:val="EE0000"/>
+        </w:rPr>
+      </w:pPr>
+      <w:r>
+        <w:rPr>
+          <w:color w:val="EE0000"/>
+        </w:rPr>
         <w:t xml:space="preserve">Backup the current </w:t>
       </w:r>
       <w:proofErr w:type="spellStart"/>
       <w:r>
+        <w:rPr>
+          <w:color w:val="EE0000"/>
+        </w:rPr>
         <w:t>NightSkyHigh</w:t>
       </w:r>
       <w:proofErr w:type="spellEnd"/>
       <w:r>
+        <w:rPr>
+          <w:color w:val="EE0000"/>
+        </w:rPr>
         <w:t xml:space="preserve"> website</w:t>
       </w:r>
     </w:p>
@@ -41,8 +59,14 @@
           <w:ilvl w:val="0"/>
           <w:numId w:val="1"/>
         </w:numPr>
-      </w:pPr>
-      <w:r>
+        <w:rPr>
+          <w:color w:val="EE0000"/>
+        </w:rPr>
+      </w:pPr>
+      <w:r>
+        <w:rPr>
+          <w:color w:val="EE0000"/>
+        </w:rPr>
         <w:t>Backup GitHub repositories and assets</w:t>
       </w:r>
     </w:p>
@@ -53,16 +77,28 @@
           <w:ilvl w:val="0"/>
           <w:numId w:val="1"/>
         </w:numPr>
-      </w:pPr>
-      <w:r>
+        <w:rPr>
+          <w:color w:val="EE0000"/>
+        </w:rPr>
+      </w:pPr>
+      <w:r>
+        <w:rPr>
+          <w:color w:val="EE0000"/>
+        </w:rPr>
         <w:t>Create a brand new project folder called something like “</w:t>
       </w:r>
       <w:proofErr w:type="spellStart"/>
       <w:r>
+        <w:rPr>
+          <w:color w:val="EE0000"/>
+        </w:rPr>
         <w:t>NightSkyHigh</w:t>
       </w:r>
       <w:proofErr w:type="spellEnd"/>
       <w:r>
+        <w:rPr>
+          <w:color w:val="EE0000"/>
+        </w:rPr>
         <w:t>-App”</w:t>
       </w:r>
     </w:p>

</xml_diff>